<commit_message>
Update September email racking amount to 1125
Co-authored-by: peterli0913 <peterli0913@users.noreply.github.com>
</commit_message>
<xml_diff>
--- a/申请邮件/2026 September PP Opex Service Monthly Budget Application.docx
+++ b/申请邮件/2026 September PP Opex Service Monthly Budget Application.docx
@@ -48,7 +48,7 @@
     </w:p>
     <w:p>
       <w:r>
-        <w:t xml:space="preserve">35,654.00</w:t>
+        <w:t xml:space="preserve">31,779.00</w:t>
       </w:r>
     </w:p>
     <w:p>
@@ -73,7 +73,7 @@
     </w:p>
     <w:p>
       <w:r>
-        <w:t xml:space="preserve">54,927.00</w:t>
+        <w:t xml:space="preserve">51,052.00</w:t>
       </w:r>
     </w:p>
     <w:p/>
@@ -95,7 +95,7 @@
     </w:p>
     <w:p>
       <w:r>
-        <w:t xml:space="preserve">35,654.00</w:t>
+        <w:t xml:space="preserve">31,779.00</w:t>
       </w:r>
     </w:p>
     <w:p>
@@ -130,7 +130,7 @@
     </w:p>
     <w:p>
       <w:r>
-        <w:t xml:space="preserve">5,000.00</w:t>
+        <w:t xml:space="preserve">1,125.00</w:t>
       </w:r>
     </w:p>
     <w:p>

</xml_diff>